<commit_message>
Add original illustrations to the student handout
Replaced the placeholder photo boxes with hand-drawn flat-style
illustrations (Fumiya at the beach, playing ukulele, swimming on the
weekend, riding the bus; Maria's portrait; loco moco) embedded
directly in the blog sheet and Cafe Maria shop card. Added a 4th page
of dashed-border cut-out cards so students can cut and paste the
correct photo into the worksheet's fact-check area, supporting the
extension "Listen and Place" map-matching task too.

Source PNGs kept under materials/images/ for reuse/editing.

Co-Authored-By: Claude Sonnet 5 <noreply@anthropic.com>
Claude-Session: https://claude.ai/code/session_014R18vVDisZXLxdU3cQ9en7
</commit_message>
<xml_diff>
--- a/materials/hawaii_input_task_student_handout.docx
+++ b/materials/hawaii_input_task_student_handout.docx
@@ -106,20 +106,16 @@
               <w:gridCol w:w="8400"/>
             </w:tblGrid>
             <w:tr>
-              <w:trPr>
-                <w:trHeight w:val="1400" w:hRule="atLeast"/>
-              </w:trPr>
               <w:tc>
                 <w:tcPr>
                   <w:tcW w:type="dxa" w:w="8400"/>
                   <w:tcBorders>
-                    <w:top w:val="dashed" w:color="8FAADC" w:sz="4"/>
-                    <w:left w:val="dashed" w:color="8FAADC" w:sz="4"/>
-                    <w:bottom w:val="dashed" w:color="8FAADC" w:sz="4"/>
-                    <w:right w:val="dashed" w:color="8FAADC" w:sz="4"/>
+                    <w:top w:val="single" w:color="8FAADC" w:sz="4"/>
+                    <w:left w:val="single" w:color="8FAADC" w:sz="4"/>
+                    <w:bottom w:val="single" w:color="8FAADC" w:sz="4"/>
+                    <w:right w:val="single" w:color="8FAADC" w:sz="4"/>
                   </w:tcBorders>
-                  <w:shd w:fill="E7ECF7" w:color="auto" w:val="clear"/>
-                  <w:vAlign w:val="center"/>
+                  <w:shd w:fill="FFFFFF" w:color="auto" w:val="clear"/>
                 </w:tcPr>
                 <w:p>
                   <w:pPr>
@@ -127,17 +123,44 @@
                     <w:jc w:val="center"/>
                   </w:pPr>
                   <w:r>
-                    <w:rPr>
-                      <w:rFonts w:ascii="游ゴシック" w:cs="游ゴシック" w:eastAsia="游ゴシック" w:hAnsi="游ゴシック"/>
-                      <w:b w:val="false"/>
-                      <w:bCs w:val="false"/>
-                      <w:i/>
-                      <w:iCs/>
-                      <w:color w:val="44546A"/>
-                      <w:sz w:val="22"/>
-                      <w:szCs w:val="22"/>
-                    </w:rPr>
-                    <w:t xml:space="preserve">[写真] ハワイのビーチに立つ文也</w:t>
+                    <w:drawing>
+                      <wp:inline distT="0" distB="0" distL="0" distR="0">
+                        <wp:extent cx="5334000" cy="3333750"/>
+                        <wp:effectExtent t="0" r="0" b="0" l="0"/>
+                        <wp:docPr id="1" name="" descr="" title=""/>
+                        <wp:cNvGraphicFramePr>
+                          <a:graphicFrameLocks xmlns:a="http://schemas.openxmlformats.org/drawingml/2006/main" noChangeAspect="1"/>
+                        </wp:cNvGraphicFramePr>
+                        <a:graphic xmlns:a="http://schemas.openxmlformats.org/drawingml/2006/main">
+                          <a:graphicData uri="http://schemas.openxmlformats.org/drawingml/2006/picture">
+                            <pic:pic xmlns:pic="http://schemas.openxmlformats.org/drawingml/2006/picture">
+                              <pic:nvPicPr>
+                                <pic:cNvPr id="0" name="" descr=""/>
+                                <pic:cNvPicPr>
+                                  <a:picLocks noChangeAspect="1" noChangeArrowheads="1"/>
+                                </pic:cNvPicPr>
+                              </pic:nvPicPr>
+                              <pic:blipFill>
+                                <a:blip r:embed="rId7" cstate="none"/>
+                                <a:srcRect/>
+                                <a:stretch>
+                                  <a:fillRect/>
+                                </a:stretch>
+                              </pic:blipFill>
+                              <pic:spPr bwMode="auto">
+                                <a:xfrm>
+                                  <a:off x="0" y="0"/>
+                                  <a:ext cx="5334000" cy="3333750"/>
+                                </a:xfrm>
+                                <a:prstGeom prst="rect">
+                                  <a:avLst/>
+                                </a:prstGeom>
+                              </pic:spPr>
+                            </pic:pic>
+                          </a:graphicData>
+                        </a:graphic>
+                      </wp:inline>
+                    </w:drawing>
                   </w:r>
                 </w:p>
               </w:tc>
@@ -213,20 +236,16 @@
               <w:gridCol w:w="8400"/>
             </w:tblGrid>
             <w:tr>
-              <w:trPr>
-                <w:trHeight w:val="1000" w:hRule="atLeast"/>
-              </w:trPr>
               <w:tc>
                 <w:tcPr>
                   <w:tcW w:type="dxa" w:w="8400"/>
                   <w:tcBorders>
-                    <w:top w:val="dashed" w:color="8FAADC" w:sz="4"/>
-                    <w:left w:val="dashed" w:color="8FAADC" w:sz="4"/>
-                    <w:bottom w:val="dashed" w:color="8FAADC" w:sz="4"/>
-                    <w:right w:val="dashed" w:color="8FAADC" w:sz="4"/>
+                    <w:top w:val="single" w:color="8FAADC" w:sz="4"/>
+                    <w:left w:val="single" w:color="8FAADC" w:sz="4"/>
+                    <w:bottom w:val="single" w:color="8FAADC" w:sz="4"/>
+                    <w:right w:val="single" w:color="8FAADC" w:sz="4"/>
                   </w:tcBorders>
-                  <w:shd w:fill="E7ECF7" w:color="auto" w:val="clear"/>
-                  <w:vAlign w:val="center"/>
+                  <w:shd w:fill="FFFFFF" w:color="auto" w:val="clear"/>
                 </w:tcPr>
                 <w:p>
                   <w:pPr>
@@ -234,17 +253,44 @@
                     <w:jc w:val="center"/>
                   </w:pPr>
                   <w:r>
-                    <w:rPr>
-                      <w:rFonts w:ascii="游ゴシック" w:cs="游ゴシック" w:eastAsia="游ゴシック" w:hAnsi="游ゴシック"/>
-                      <w:b w:val="false"/>
-                      <w:bCs w:val="false"/>
-                      <w:i/>
-                      <w:iCs/>
-                      <w:color w:val="44546A"/>
-                      <w:sz w:val="22"/>
-                      <w:szCs w:val="22"/>
-                    </w:rPr>
-                    <w:t xml:space="preserve">[写真] ウクレレを弾く文也</w:t>
+                    <w:drawing>
+                      <wp:inline distT="0" distB="0" distL="0" distR="0">
+                        <wp:extent cx="4572000" cy="2857500"/>
+                        <wp:effectExtent t="0" r="0" b="0" l="0"/>
+                        <wp:docPr id="1" name="" descr="" title=""/>
+                        <wp:cNvGraphicFramePr>
+                          <a:graphicFrameLocks xmlns:a="http://schemas.openxmlformats.org/drawingml/2006/main" noChangeAspect="1"/>
+                        </wp:cNvGraphicFramePr>
+                        <a:graphic xmlns:a="http://schemas.openxmlformats.org/drawingml/2006/main">
+                          <a:graphicData uri="http://schemas.openxmlformats.org/drawingml/2006/picture">
+                            <pic:pic xmlns:pic="http://schemas.openxmlformats.org/drawingml/2006/picture">
+                              <pic:nvPicPr>
+                                <pic:cNvPr id="0" name="" descr=""/>
+                                <pic:cNvPicPr>
+                                  <a:picLocks noChangeAspect="1" noChangeArrowheads="1"/>
+                                </pic:cNvPicPr>
+                              </pic:nvPicPr>
+                              <pic:blipFill>
+                                <a:blip r:embed="rId8" cstate="none"/>
+                                <a:srcRect/>
+                                <a:stretch>
+                                  <a:fillRect/>
+                                </a:stretch>
+                              </pic:blipFill>
+                              <pic:spPr bwMode="auto">
+                                <a:xfrm>
+                                  <a:off x="0" y="0"/>
+                                  <a:ext cx="4572000" cy="2857500"/>
+                                </a:xfrm>
+                                <a:prstGeom prst="rect">
+                                  <a:avLst/>
+                                </a:prstGeom>
+                              </pic:spPr>
+                            </pic:pic>
+                          </a:graphicData>
+                        </a:graphic>
+                      </wp:inline>
+                    </w:drawing>
                   </w:r>
                 </w:p>
               </w:tc>
@@ -284,20 +330,16 @@
               <w:gridCol w:w="8400"/>
             </w:tblGrid>
             <w:tr>
-              <w:trPr>
-                <w:trHeight w:val="1000" w:hRule="atLeast"/>
-              </w:trPr>
               <w:tc>
                 <w:tcPr>
                   <w:tcW w:type="dxa" w:w="8400"/>
                   <w:tcBorders>
-                    <w:top w:val="dashed" w:color="8FAADC" w:sz="4"/>
-                    <w:left w:val="dashed" w:color="8FAADC" w:sz="4"/>
-                    <w:bottom w:val="dashed" w:color="8FAADC" w:sz="4"/>
-                    <w:right w:val="dashed" w:color="8FAADC" w:sz="4"/>
+                    <w:top w:val="single" w:color="8FAADC" w:sz="4"/>
+                    <w:left w:val="single" w:color="8FAADC" w:sz="4"/>
+                    <w:bottom w:val="single" w:color="8FAADC" w:sz="4"/>
+                    <w:right w:val="single" w:color="8FAADC" w:sz="4"/>
                   </w:tcBorders>
-                  <w:shd w:fill="E7ECF7" w:color="auto" w:val="clear"/>
-                  <w:vAlign w:val="center"/>
+                  <w:shd w:fill="FFFFFF" w:color="auto" w:val="clear"/>
                 </w:tcPr>
                 <w:p>
                   <w:pPr>
@@ -305,17 +347,44 @@
                     <w:jc w:val="center"/>
                   </w:pPr>
                   <w:r>
-                    <w:rPr>
-                      <w:rFonts w:ascii="游ゴシック" w:cs="游ゴシック" w:eastAsia="游ゴシック" w:hAnsi="游ゴシック"/>
-                      <w:b w:val="false"/>
-                      <w:bCs w:val="false"/>
-                      <w:i/>
-                      <w:iCs/>
-                      <w:color w:val="44546A"/>
-                      <w:sz w:val="22"/>
-                      <w:szCs w:val="22"/>
-                    </w:rPr>
-                    <w:t xml:space="preserve">[写真] ビーチで遊ぶ様子</w:t>
+                    <w:drawing>
+                      <wp:inline distT="0" distB="0" distL="0" distR="0">
+                        <wp:extent cx="4572000" cy="2857500"/>
+                        <wp:effectExtent t="0" r="0" b="0" l="0"/>
+                        <wp:docPr id="1" name="" descr="" title=""/>
+                        <wp:cNvGraphicFramePr>
+                          <a:graphicFrameLocks xmlns:a="http://schemas.openxmlformats.org/drawingml/2006/main" noChangeAspect="1"/>
+                        </wp:cNvGraphicFramePr>
+                        <a:graphic xmlns:a="http://schemas.openxmlformats.org/drawingml/2006/main">
+                          <a:graphicData uri="http://schemas.openxmlformats.org/drawingml/2006/picture">
+                            <pic:pic xmlns:pic="http://schemas.openxmlformats.org/drawingml/2006/picture">
+                              <pic:nvPicPr>
+                                <pic:cNvPr id="0" name="" descr=""/>
+                                <pic:cNvPicPr>
+                                  <a:picLocks noChangeAspect="1" noChangeArrowheads="1"/>
+                                </pic:cNvPicPr>
+                              </pic:nvPicPr>
+                              <pic:blipFill>
+                                <a:blip r:embed="rId9" cstate="none"/>
+                                <a:srcRect/>
+                                <a:stretch>
+                                  <a:fillRect/>
+                                </a:stretch>
+                              </pic:blipFill>
+                              <pic:spPr bwMode="auto">
+                                <a:xfrm>
+                                  <a:off x="0" y="0"/>
+                                  <a:ext cx="4572000" cy="2857500"/>
+                                </a:xfrm>
+                                <a:prstGeom prst="rect">
+                                  <a:avLst/>
+                                </a:prstGeom>
+                              </pic:spPr>
+                            </pic:pic>
+                          </a:graphicData>
+                        </a:graphic>
+                      </wp:inline>
+                    </w:drawing>
                   </w:r>
                 </w:p>
               </w:tc>
@@ -355,20 +424,16 @@
               <w:gridCol w:w="8400"/>
             </w:tblGrid>
             <w:tr>
-              <w:trPr>
-                <w:trHeight w:val="1000" w:hRule="atLeast"/>
-              </w:trPr>
               <w:tc>
                 <w:tcPr>
                   <w:tcW w:type="dxa" w:w="8400"/>
                   <w:tcBorders>
-                    <w:top w:val="dashed" w:color="8FAADC" w:sz="4"/>
-                    <w:left w:val="dashed" w:color="8FAADC" w:sz="4"/>
-                    <w:bottom w:val="dashed" w:color="8FAADC" w:sz="4"/>
-                    <w:right w:val="dashed" w:color="8FAADC" w:sz="4"/>
+                    <w:top w:val="single" w:color="8FAADC" w:sz="4"/>
+                    <w:left w:val="single" w:color="8FAADC" w:sz="4"/>
+                    <w:bottom w:val="single" w:color="8FAADC" w:sz="4"/>
+                    <w:right w:val="single" w:color="8FAADC" w:sz="4"/>
                   </w:tcBorders>
-                  <w:shd w:fill="E7ECF7" w:color="auto" w:val="clear"/>
-                  <w:vAlign w:val="center"/>
+                  <w:shd w:fill="FFFFFF" w:color="auto" w:val="clear"/>
                 </w:tcPr>
                 <w:p>
                   <w:pPr>
@@ -376,17 +441,44 @@
                     <w:jc w:val="center"/>
                   </w:pPr>
                   <w:r>
-                    <w:rPr>
-                      <w:rFonts w:ascii="游ゴシック" w:cs="游ゴシック" w:eastAsia="游ゴシック" w:hAnsi="游ゴシック"/>
-                      <w:b w:val="false"/>
-                      <w:bCs w:val="false"/>
-                      <w:i/>
-                      <w:iCs/>
-                      <w:color w:val="44546A"/>
-                      <w:sz w:val="22"/>
-                      <w:szCs w:val="22"/>
-                    </w:rPr>
-                    <w:t xml:space="preserve">[写真] バスに乗る文也</w:t>
+                    <w:drawing>
+                      <wp:inline distT="0" distB="0" distL="0" distR="0">
+                        <wp:extent cx="4572000" cy="2857500"/>
+                        <wp:effectExtent t="0" r="0" b="0" l="0"/>
+                        <wp:docPr id="1" name="" descr="" title=""/>
+                        <wp:cNvGraphicFramePr>
+                          <a:graphicFrameLocks xmlns:a="http://schemas.openxmlformats.org/drawingml/2006/main" noChangeAspect="1"/>
+                        </wp:cNvGraphicFramePr>
+                        <a:graphic xmlns:a="http://schemas.openxmlformats.org/drawingml/2006/main">
+                          <a:graphicData uri="http://schemas.openxmlformats.org/drawingml/2006/picture">
+                            <pic:pic xmlns:pic="http://schemas.openxmlformats.org/drawingml/2006/picture">
+                              <pic:nvPicPr>
+                                <pic:cNvPr id="0" name="" descr=""/>
+                                <pic:cNvPicPr>
+                                  <a:picLocks noChangeAspect="1" noChangeArrowheads="1"/>
+                                </pic:cNvPicPr>
+                              </pic:nvPicPr>
+                              <pic:blipFill>
+                                <a:blip r:embed="rId10" cstate="none"/>
+                                <a:srcRect/>
+                                <a:stretch>
+                                  <a:fillRect/>
+                                </a:stretch>
+                              </pic:blipFill>
+                              <pic:spPr bwMode="auto">
+                                <a:xfrm>
+                                  <a:off x="0" y="0"/>
+                                  <a:ext cx="4572000" cy="2857500"/>
+                                </a:xfrm>
+                                <a:prstGeom prst="rect">
+                                  <a:avLst/>
+                                </a:prstGeom>
+                              </pic:spPr>
+                            </pic:pic>
+                          </a:graphicData>
+                        </a:graphic>
+                      </wp:inline>
+                    </w:drawing>
                   </w:r>
                 </w:p>
               </w:tc>
@@ -545,20 +637,16 @@
               <w:gridCol w:w="8400"/>
             </w:tblGrid>
             <w:tr>
-              <w:trPr>
-                <w:trHeight w:val="1400" w:hRule="atLeast"/>
-              </w:trPr>
               <w:tc>
                 <w:tcPr>
                   <w:tcW w:type="dxa" w:w="8400"/>
                   <w:tcBorders>
-                    <w:top w:val="dashed" w:color="8FAADC" w:sz="4"/>
-                    <w:left w:val="dashed" w:color="8FAADC" w:sz="4"/>
-                    <w:bottom w:val="dashed" w:color="8FAADC" w:sz="4"/>
-                    <w:right w:val="dashed" w:color="8FAADC" w:sz="4"/>
+                    <w:top w:val="single" w:color="8FAADC" w:sz="4"/>
+                    <w:left w:val="single" w:color="8FAADC" w:sz="4"/>
+                    <w:bottom w:val="single" w:color="8FAADC" w:sz="4"/>
+                    <w:right w:val="single" w:color="8FAADC" w:sz="4"/>
                   </w:tcBorders>
-                  <w:shd w:fill="E7ECF7" w:color="auto" w:val="clear"/>
-                  <w:vAlign w:val="center"/>
+                  <w:shd w:fill="FFFFFF" w:color="auto" w:val="clear"/>
                 </w:tcPr>
                 <w:p>
                   <w:pPr>
@@ -566,17 +654,44 @@
                     <w:jc w:val="center"/>
                   </w:pPr>
                   <w:r>
-                    <w:rPr>
-                      <w:rFonts w:ascii="游ゴシック" w:cs="游ゴシック" w:eastAsia="游ゴシック" w:hAnsi="游ゴシック"/>
-                      <w:b w:val="false"/>
-                      <w:bCs w:val="false"/>
-                      <w:i/>
-                      <w:iCs/>
-                      <w:color w:val="44546A"/>
-                      <w:sz w:val="22"/>
-                      <w:szCs w:val="22"/>
-                    </w:rPr>
-                    <w:t xml:space="preserve">[写真] 店主マリアの笑顔</w:t>
+                    <w:drawing>
+                      <wp:inline distT="0" distB="0" distL="0" distR="0">
+                        <wp:extent cx="4572000" cy="2857500"/>
+                        <wp:effectExtent t="0" r="0" b="0" l="0"/>
+                        <wp:docPr id="1" name="" descr="" title=""/>
+                        <wp:cNvGraphicFramePr>
+                          <a:graphicFrameLocks xmlns:a="http://schemas.openxmlformats.org/drawingml/2006/main" noChangeAspect="1"/>
+                        </wp:cNvGraphicFramePr>
+                        <a:graphic xmlns:a="http://schemas.openxmlformats.org/drawingml/2006/main">
+                          <a:graphicData uri="http://schemas.openxmlformats.org/drawingml/2006/picture">
+                            <pic:pic xmlns:pic="http://schemas.openxmlformats.org/drawingml/2006/picture">
+                              <pic:nvPicPr>
+                                <pic:cNvPr id="0" name="" descr=""/>
+                                <pic:cNvPicPr>
+                                  <a:picLocks noChangeAspect="1" noChangeArrowheads="1"/>
+                                </pic:cNvPicPr>
+                              </pic:nvPicPr>
+                              <pic:blipFill>
+                                <a:blip r:embed="rId11" cstate="none"/>
+                                <a:srcRect/>
+                                <a:stretch>
+                                  <a:fillRect/>
+                                </a:stretch>
+                              </pic:blipFill>
+                              <pic:spPr bwMode="auto">
+                                <a:xfrm>
+                                  <a:off x="0" y="0"/>
+                                  <a:ext cx="4572000" cy="2857500"/>
+                                </a:xfrm>
+                                <a:prstGeom prst="rect">
+                                  <a:avLst/>
+                                </a:prstGeom>
+                              </pic:spPr>
+                            </pic:pic>
+                          </a:graphicData>
+                        </a:graphic>
+                      </wp:inline>
+                    </w:drawing>
                   </w:r>
                 </w:p>
               </w:tc>
@@ -670,20 +785,16 @@
               <w:gridCol w:w="8400"/>
             </w:tblGrid>
             <w:tr>
-              <w:trPr>
-                <w:trHeight w:val="1000" w:hRule="atLeast"/>
-              </w:trPr>
               <w:tc>
                 <w:tcPr>
                   <w:tcW w:type="dxa" w:w="8400"/>
                   <w:tcBorders>
-                    <w:top w:val="dashed" w:color="8FAADC" w:sz="4"/>
-                    <w:left w:val="dashed" w:color="8FAADC" w:sz="4"/>
-                    <w:bottom w:val="dashed" w:color="8FAADC" w:sz="4"/>
-                    <w:right w:val="dashed" w:color="8FAADC" w:sz="4"/>
+                    <w:top w:val="single" w:color="8FAADC" w:sz="4"/>
+                    <w:left w:val="single" w:color="8FAADC" w:sz="4"/>
+                    <w:bottom w:val="single" w:color="8FAADC" w:sz="4"/>
+                    <w:right w:val="single" w:color="8FAADC" w:sz="4"/>
                   </w:tcBorders>
-                  <w:shd w:fill="E7ECF7" w:color="auto" w:val="clear"/>
-                  <w:vAlign w:val="center"/>
+                  <w:shd w:fill="FFFFFF" w:color="auto" w:val="clear"/>
                 </w:tcPr>
                 <w:p>
                   <w:pPr>
@@ -691,17 +802,44 @@
                     <w:jc w:val="center"/>
                   </w:pPr>
                   <w:r>
-                    <w:rPr>
-                      <w:rFonts w:ascii="游ゴシック" w:cs="游ゴシック" w:eastAsia="游ゴシック" w:hAnsi="游ゴシック"/>
-                      <w:b w:val="false"/>
-                      <w:bCs w:val="false"/>
-                      <w:i/>
-                      <w:iCs/>
-                      <w:color w:val="44546A"/>
-                      <w:sz w:val="22"/>
-                      <w:szCs w:val="22"/>
-                    </w:rPr>
-                    <w:t xml:space="preserve">[写真] ロコモコ（ハンバーグ＋目玉焼き＋ご飯）</w:t>
+                    <w:drawing>
+                      <wp:inline distT="0" distB="0" distL="0" distR="0">
+                        <wp:extent cx="4572000" cy="2857500"/>
+                        <wp:effectExtent t="0" r="0" b="0" l="0"/>
+                        <wp:docPr id="1" name="" descr="" title=""/>
+                        <wp:cNvGraphicFramePr>
+                          <a:graphicFrameLocks xmlns:a="http://schemas.openxmlformats.org/drawingml/2006/main" noChangeAspect="1"/>
+                        </wp:cNvGraphicFramePr>
+                        <a:graphic xmlns:a="http://schemas.openxmlformats.org/drawingml/2006/main">
+                          <a:graphicData uri="http://schemas.openxmlformats.org/drawingml/2006/picture">
+                            <pic:pic xmlns:pic="http://schemas.openxmlformats.org/drawingml/2006/picture">
+                              <pic:nvPicPr>
+                                <pic:cNvPr id="0" name="" descr=""/>
+                                <pic:cNvPicPr>
+                                  <a:picLocks noChangeAspect="1" noChangeArrowheads="1"/>
+                                </pic:cNvPicPr>
+                              </pic:nvPicPr>
+                              <pic:blipFill>
+                                <a:blip r:embed="rId12" cstate="none"/>
+                                <a:srcRect/>
+                                <a:stretch>
+                                  <a:fillRect/>
+                                </a:stretch>
+                              </pic:blipFill>
+                              <pic:spPr bwMode="auto">
+                                <a:xfrm>
+                                  <a:off x="0" y="0"/>
+                                  <a:ext cx="4572000" cy="2857500"/>
+                                </a:xfrm>
+                                <a:prstGeom prst="rect">
+                                  <a:avLst/>
+                                </a:prstGeom>
+                              </pic:spPr>
+                            </pic:pic>
+                          </a:graphicData>
+                        </a:graphic>
+                      </wp:inline>
+                    </w:drawing>
                   </w:r>
                 </w:p>
               </w:tc>
@@ -2465,6 +2603,613 @@
         <w:t xml:space="preserve"/>
       </w:r>
     </w:p>
+    <w:p>
+      <w:pPr>
+        <w:sectPr>
+          <w:pgSz w:w="12240" w:h="15840" w:orient="portrait"/>
+          <w:pgMar w:top="700" w:right="900" w:bottom="700" w:left="900" w:header="708" w:footer="708" w:gutter="0"/>
+          <w:pgNumType/>
+          <w:docGrid w:linePitch="360"/>
+        </w:sectPr>
+      </w:pPr>
+    </w:p>
+    <w:p>
+      <w:pPr>
+        <w:shd w:fill="4472C4" w:color="auto" w:val="clear"/>
+        <w:spacing w:after="160" w:before="300"/>
+        <w:jc w:val="left"/>
+      </w:pPr>
+      <w:r>
+        <w:rPr>
+          <w:rFonts w:ascii="游ゴシック" w:cs="游ゴシック" w:eastAsia="游ゴシック" w:hAnsi="游ゴシック"/>
+          <w:b/>
+          <w:bCs/>
+          <w:color w:val="FFFFFF"/>
+          <w:sz w:val="26"/>
+          <w:szCs w:val="26"/>
+        </w:rPr>
+        <w:t xml:space="preserve">切り取りカード（教師用：人数分コピーして配布・切り取り）</w:t>
+      </w:r>
+    </w:p>
+    <w:p>
+      <w:pPr>
+        <w:spacing w:after="200"/>
+        <w:jc w:val="left"/>
+      </w:pPr>
+      <w:r>
+        <w:rPr>
+          <w:rFonts w:ascii="游ゴシック" w:cs="游ゴシック" w:eastAsia="游ゴシック" w:hAnsi="游ゴシック"/>
+          <w:b w:val="false"/>
+          <w:bCs w:val="false"/>
+          <w:i w:val="false"/>
+          <w:iCs w:val="false"/>
+          <w:sz w:val="20"/>
+          <w:szCs w:val="20"/>
+        </w:rPr>
+        <w:t xml:space="preserve">点線に沿って切り取り、ワークシートの写真カード貼付エリアに貼ろう。</w:t>
+      </w:r>
+    </w:p>
+    <w:tbl>
+      <w:tblPr>
+        <w:tblW w:type="dxa" w:w="9000"/>
+        <w:tblBorders>
+          <w:top w:val="single" w:color="auto" w:sz="4"/>
+          <w:left w:val="single" w:color="auto" w:sz="4"/>
+          <w:bottom w:val="single" w:color="auto" w:sz="4"/>
+          <w:right w:val="single" w:color="auto" w:sz="4"/>
+          <w:insideH w:val="single" w:color="auto" w:sz="4"/>
+          <w:insideV w:val="single" w:color="auto" w:sz="4"/>
+        </w:tblBorders>
+      </w:tblPr>
+      <w:tblGrid>
+        <w:gridCol w:w="2250"/>
+        <w:gridCol w:w="2250"/>
+        <w:gridCol w:w="2250"/>
+        <w:gridCol w:w="2250"/>
+      </w:tblGrid>
+      <w:tr>
+        <w:tc>
+          <w:tcPr>
+            <w:tcW w:type="dxa" w:w="2150"/>
+            <w:tcBorders>
+              <w:top w:val="dashed" w:color="999999" w:sz="4"/>
+              <w:left w:val="dashed" w:color="999999" w:sz="4"/>
+              <w:bottom w:val="dashed" w:color="999999" w:sz="4"/>
+              <w:right w:val="dashed" w:color="999999" w:sz="4"/>
+            </w:tcBorders>
+            <w:shd w:fill="FFFFFF" w:color="auto" w:val="clear"/>
+            <w:tcMar>
+              <w:top w:type="dxa" w:w="80"/>
+              <w:left w:type="dxa" w:w="60"/>
+              <w:bottom w:type="dxa" w:w="80"/>
+              <w:right w:type="dxa" w:w="60"/>
+            </w:tcMar>
+          </w:tcPr>
+          <w:p>
+            <w:pPr>
+              <w:spacing w:after="40"/>
+              <w:jc w:val="center"/>
+            </w:pPr>
+            <w:r>
+              <w:drawing>
+                <wp:inline distT="0" distB="0" distL="0" distR="0">
+                  <wp:extent cx="1809750" cy="1133475"/>
+                  <wp:effectExtent t="0" r="0" b="0" l="0"/>
+                  <wp:docPr id="1" name="" descr="" title=""/>
+                  <wp:cNvGraphicFramePr>
+                    <a:graphicFrameLocks xmlns:a="http://schemas.openxmlformats.org/drawingml/2006/main" noChangeAspect="1"/>
+                  </wp:cNvGraphicFramePr>
+                  <a:graphic xmlns:a="http://schemas.openxmlformats.org/drawingml/2006/main">
+                    <a:graphicData uri="http://schemas.openxmlformats.org/drawingml/2006/picture">
+                      <pic:pic xmlns:pic="http://schemas.openxmlformats.org/drawingml/2006/picture">
+                        <pic:nvPicPr>
+                          <pic:cNvPr id="0" name="" descr=""/>
+                          <pic:cNvPicPr>
+                            <a:picLocks noChangeAspect="1" noChangeArrowheads="1"/>
+                          </pic:cNvPicPr>
+                        </pic:nvPicPr>
+                        <pic:blipFill>
+                          <a:blip r:embed="rId7" cstate="none"/>
+                          <a:srcRect/>
+                          <a:stretch>
+                            <a:fillRect/>
+                          </a:stretch>
+                        </pic:blipFill>
+                        <pic:spPr bwMode="auto">
+                          <a:xfrm>
+                            <a:off x="0" y="0"/>
+                            <a:ext cx="1809750" cy="1133475"/>
+                          </a:xfrm>
+                          <a:prstGeom prst="rect">
+                            <a:avLst/>
+                          </a:prstGeom>
+                        </pic:spPr>
+                      </pic:pic>
+                    </a:graphicData>
+                  </a:graphic>
+                </wp:inline>
+              </w:drawing>
+            </w:r>
+          </w:p>
+          <w:p>
+            <w:pPr>
+              <w:spacing w:after="0"/>
+              <w:jc w:val="center"/>
+            </w:pPr>
+            <w:r>
+              <w:rPr>
+                <w:rFonts w:ascii="游ゴシック" w:cs="游ゴシック" w:eastAsia="游ゴシック" w:hAnsi="游ゴシック"/>
+                <w:b w:val="false"/>
+                <w:bCs w:val="false"/>
+                <w:i w:val="false"/>
+                <w:iCs w:val="false"/>
+                <w:sz w:val="16"/>
+                <w:szCs w:val="16"/>
+              </w:rPr>
+              <w:t xml:space="preserve">ビーチに立つ文也</w:t>
+            </w:r>
+          </w:p>
+        </w:tc>
+        <w:tc>
+          <w:tcPr>
+            <w:tcW w:type="dxa" w:w="2150"/>
+            <w:tcBorders>
+              <w:top w:val="dashed" w:color="999999" w:sz="4"/>
+              <w:left w:val="dashed" w:color="999999" w:sz="4"/>
+              <w:bottom w:val="dashed" w:color="999999" w:sz="4"/>
+              <w:right w:val="dashed" w:color="999999" w:sz="4"/>
+            </w:tcBorders>
+            <w:shd w:fill="FFFFFF" w:color="auto" w:val="clear"/>
+            <w:tcMar>
+              <w:top w:type="dxa" w:w="80"/>
+              <w:left w:type="dxa" w:w="60"/>
+              <w:bottom w:type="dxa" w:w="80"/>
+              <w:right w:type="dxa" w:w="60"/>
+            </w:tcMar>
+          </w:tcPr>
+          <w:p>
+            <w:pPr>
+              <w:spacing w:after="40"/>
+              <w:jc w:val="center"/>
+            </w:pPr>
+            <w:r>
+              <w:drawing>
+                <wp:inline distT="0" distB="0" distL="0" distR="0">
+                  <wp:extent cx="1809750" cy="1133475"/>
+                  <wp:effectExtent t="0" r="0" b="0" l="0"/>
+                  <wp:docPr id="1" name="" descr="" title=""/>
+                  <wp:cNvGraphicFramePr>
+                    <a:graphicFrameLocks xmlns:a="http://schemas.openxmlformats.org/drawingml/2006/main" noChangeAspect="1"/>
+                  </wp:cNvGraphicFramePr>
+                  <a:graphic xmlns:a="http://schemas.openxmlformats.org/drawingml/2006/main">
+                    <a:graphicData uri="http://schemas.openxmlformats.org/drawingml/2006/picture">
+                      <pic:pic xmlns:pic="http://schemas.openxmlformats.org/drawingml/2006/picture">
+                        <pic:nvPicPr>
+                          <pic:cNvPr id="0" name="" descr=""/>
+                          <pic:cNvPicPr>
+                            <a:picLocks noChangeAspect="1" noChangeArrowheads="1"/>
+                          </pic:cNvPicPr>
+                        </pic:nvPicPr>
+                        <pic:blipFill>
+                          <a:blip r:embed="rId8" cstate="none"/>
+                          <a:srcRect/>
+                          <a:stretch>
+                            <a:fillRect/>
+                          </a:stretch>
+                        </pic:blipFill>
+                        <pic:spPr bwMode="auto">
+                          <a:xfrm>
+                            <a:off x="0" y="0"/>
+                            <a:ext cx="1809750" cy="1133475"/>
+                          </a:xfrm>
+                          <a:prstGeom prst="rect">
+                            <a:avLst/>
+                          </a:prstGeom>
+                        </pic:spPr>
+                      </pic:pic>
+                    </a:graphicData>
+                  </a:graphic>
+                </wp:inline>
+              </w:drawing>
+            </w:r>
+          </w:p>
+          <w:p>
+            <w:pPr>
+              <w:spacing w:after="0"/>
+              <w:jc w:val="center"/>
+            </w:pPr>
+            <w:r>
+              <w:rPr>
+                <w:rFonts w:ascii="游ゴシック" w:cs="游ゴシック" w:eastAsia="游ゴシック" w:hAnsi="游ゴシック"/>
+                <w:b w:val="false"/>
+                <w:bCs w:val="false"/>
+                <w:i w:val="false"/>
+                <w:iCs w:val="false"/>
+                <w:sz w:val="16"/>
+                <w:szCs w:val="16"/>
+              </w:rPr>
+              <w:t xml:space="preserve">ウクレレを弾く文也</w:t>
+            </w:r>
+          </w:p>
+        </w:tc>
+        <w:tc>
+          <w:tcPr>
+            <w:tcW w:type="dxa" w:w="2150"/>
+            <w:tcBorders>
+              <w:top w:val="dashed" w:color="999999" w:sz="4"/>
+              <w:left w:val="dashed" w:color="999999" w:sz="4"/>
+              <w:bottom w:val="dashed" w:color="999999" w:sz="4"/>
+              <w:right w:val="dashed" w:color="999999" w:sz="4"/>
+            </w:tcBorders>
+            <w:shd w:fill="FFFFFF" w:color="auto" w:val="clear"/>
+            <w:tcMar>
+              <w:top w:type="dxa" w:w="80"/>
+              <w:left w:type="dxa" w:w="60"/>
+              <w:bottom w:type="dxa" w:w="80"/>
+              <w:right w:type="dxa" w:w="60"/>
+            </w:tcMar>
+          </w:tcPr>
+          <w:p>
+            <w:pPr>
+              <w:spacing w:after="40"/>
+              <w:jc w:val="center"/>
+            </w:pPr>
+            <w:r>
+              <w:drawing>
+                <wp:inline distT="0" distB="0" distL="0" distR="0">
+                  <wp:extent cx="1809750" cy="1133475"/>
+                  <wp:effectExtent t="0" r="0" b="0" l="0"/>
+                  <wp:docPr id="1" name="" descr="" title=""/>
+                  <wp:cNvGraphicFramePr>
+                    <a:graphicFrameLocks xmlns:a="http://schemas.openxmlformats.org/drawingml/2006/main" noChangeAspect="1"/>
+                  </wp:cNvGraphicFramePr>
+                  <a:graphic xmlns:a="http://schemas.openxmlformats.org/drawingml/2006/main">
+                    <a:graphicData uri="http://schemas.openxmlformats.org/drawingml/2006/picture">
+                      <pic:pic xmlns:pic="http://schemas.openxmlformats.org/drawingml/2006/picture">
+                        <pic:nvPicPr>
+                          <pic:cNvPr id="0" name="" descr=""/>
+                          <pic:cNvPicPr>
+                            <a:picLocks noChangeAspect="1" noChangeArrowheads="1"/>
+                          </pic:cNvPicPr>
+                        </pic:nvPicPr>
+                        <pic:blipFill>
+                          <a:blip r:embed="rId9" cstate="none"/>
+                          <a:srcRect/>
+                          <a:stretch>
+                            <a:fillRect/>
+                          </a:stretch>
+                        </pic:blipFill>
+                        <pic:spPr bwMode="auto">
+                          <a:xfrm>
+                            <a:off x="0" y="0"/>
+                            <a:ext cx="1809750" cy="1133475"/>
+                          </a:xfrm>
+                          <a:prstGeom prst="rect">
+                            <a:avLst/>
+                          </a:prstGeom>
+                        </pic:spPr>
+                      </pic:pic>
+                    </a:graphicData>
+                  </a:graphic>
+                </wp:inline>
+              </w:drawing>
+            </w:r>
+          </w:p>
+          <w:p>
+            <w:pPr>
+              <w:spacing w:after="0"/>
+              <w:jc w:val="center"/>
+            </w:pPr>
+            <w:r>
+              <w:rPr>
+                <w:rFonts w:ascii="游ゴシック" w:cs="游ゴシック" w:eastAsia="游ゴシック" w:hAnsi="游ゴシック"/>
+                <w:b w:val="false"/>
+                <w:bCs w:val="false"/>
+                <w:i w:val="false"/>
+                <w:iCs w:val="false"/>
+                <w:sz w:val="16"/>
+                <w:szCs w:val="16"/>
+              </w:rPr>
+              <w:t xml:space="preserve">週末のビーチ</w:t>
+            </w:r>
+          </w:p>
+        </w:tc>
+        <w:tc>
+          <w:tcPr>
+            <w:tcW w:type="dxa" w:w="2150"/>
+            <w:tcBorders>
+              <w:top w:val="dashed" w:color="999999" w:sz="4"/>
+              <w:left w:val="dashed" w:color="999999" w:sz="4"/>
+              <w:bottom w:val="dashed" w:color="999999" w:sz="4"/>
+              <w:right w:val="dashed" w:color="999999" w:sz="4"/>
+            </w:tcBorders>
+            <w:shd w:fill="FFFFFF" w:color="auto" w:val="clear"/>
+            <w:tcMar>
+              <w:top w:type="dxa" w:w="80"/>
+              <w:left w:type="dxa" w:w="60"/>
+              <w:bottom w:type="dxa" w:w="80"/>
+              <w:right w:type="dxa" w:w="60"/>
+            </w:tcMar>
+          </w:tcPr>
+          <w:p>
+            <w:pPr>
+              <w:spacing w:after="40"/>
+              <w:jc w:val="center"/>
+            </w:pPr>
+            <w:r>
+              <w:drawing>
+                <wp:inline distT="0" distB="0" distL="0" distR="0">
+                  <wp:extent cx="1809750" cy="1133475"/>
+                  <wp:effectExtent t="0" r="0" b="0" l="0"/>
+                  <wp:docPr id="1" name="" descr="" title=""/>
+                  <wp:cNvGraphicFramePr>
+                    <a:graphicFrameLocks xmlns:a="http://schemas.openxmlformats.org/drawingml/2006/main" noChangeAspect="1"/>
+                  </wp:cNvGraphicFramePr>
+                  <a:graphic xmlns:a="http://schemas.openxmlformats.org/drawingml/2006/main">
+                    <a:graphicData uri="http://schemas.openxmlformats.org/drawingml/2006/picture">
+                      <pic:pic xmlns:pic="http://schemas.openxmlformats.org/drawingml/2006/picture">
+                        <pic:nvPicPr>
+                          <pic:cNvPr id="0" name="" descr=""/>
+                          <pic:cNvPicPr>
+                            <a:picLocks noChangeAspect="1" noChangeArrowheads="1"/>
+                          </pic:cNvPicPr>
+                        </pic:nvPicPr>
+                        <pic:blipFill>
+                          <a:blip r:embed="rId10" cstate="none"/>
+                          <a:srcRect/>
+                          <a:stretch>
+                            <a:fillRect/>
+                          </a:stretch>
+                        </pic:blipFill>
+                        <pic:spPr bwMode="auto">
+                          <a:xfrm>
+                            <a:off x="0" y="0"/>
+                            <a:ext cx="1809750" cy="1133475"/>
+                          </a:xfrm>
+                          <a:prstGeom prst="rect">
+                            <a:avLst/>
+                          </a:prstGeom>
+                        </pic:spPr>
+                      </pic:pic>
+                    </a:graphicData>
+                  </a:graphic>
+                </wp:inline>
+              </w:drawing>
+            </w:r>
+          </w:p>
+          <w:p>
+            <w:pPr>
+              <w:spacing w:after="0"/>
+              <w:jc w:val="center"/>
+            </w:pPr>
+            <w:r>
+              <w:rPr>
+                <w:rFonts w:ascii="游ゴシック" w:cs="游ゴシック" w:eastAsia="游ゴシック" w:hAnsi="游ゴシック"/>
+                <w:b w:val="false"/>
+                <w:bCs w:val="false"/>
+                <w:i w:val="false"/>
+                <w:iCs w:val="false"/>
+                <w:sz w:val="16"/>
+                <w:szCs w:val="16"/>
+              </w:rPr>
+              <w:t xml:space="preserve">バスに乗る文也</w:t>
+            </w:r>
+          </w:p>
+        </w:tc>
+      </w:tr>
+      <w:tr>
+        <w:tc>
+          <w:tcPr>
+            <w:tcW w:type="dxa" w:w="2150"/>
+            <w:tcBorders>
+              <w:top w:val="dashed" w:color="999999" w:sz="4"/>
+              <w:left w:val="dashed" w:color="999999" w:sz="4"/>
+              <w:bottom w:val="dashed" w:color="999999" w:sz="4"/>
+              <w:right w:val="dashed" w:color="999999" w:sz="4"/>
+            </w:tcBorders>
+            <w:shd w:fill="FFFFFF" w:color="auto" w:val="clear"/>
+            <w:tcMar>
+              <w:top w:type="dxa" w:w="80"/>
+              <w:left w:type="dxa" w:w="60"/>
+              <w:bottom w:type="dxa" w:w="80"/>
+              <w:right w:type="dxa" w:w="60"/>
+            </w:tcMar>
+          </w:tcPr>
+          <w:p>
+            <w:pPr>
+              <w:spacing w:after="40"/>
+              <w:jc w:val="center"/>
+            </w:pPr>
+            <w:r>
+              <w:drawing>
+                <wp:inline distT="0" distB="0" distL="0" distR="0">
+                  <wp:extent cx="1809750" cy="1133475"/>
+                  <wp:effectExtent t="0" r="0" b="0" l="0"/>
+                  <wp:docPr id="1" name="" descr="" title=""/>
+                  <wp:cNvGraphicFramePr>
+                    <a:graphicFrameLocks xmlns:a="http://schemas.openxmlformats.org/drawingml/2006/main" noChangeAspect="1"/>
+                  </wp:cNvGraphicFramePr>
+                  <a:graphic xmlns:a="http://schemas.openxmlformats.org/drawingml/2006/main">
+                    <a:graphicData uri="http://schemas.openxmlformats.org/drawingml/2006/picture">
+                      <pic:pic xmlns:pic="http://schemas.openxmlformats.org/drawingml/2006/picture">
+                        <pic:nvPicPr>
+                          <pic:cNvPr id="0" name="" descr=""/>
+                          <pic:cNvPicPr>
+                            <a:picLocks noChangeAspect="1" noChangeArrowheads="1"/>
+                          </pic:cNvPicPr>
+                        </pic:nvPicPr>
+                        <pic:blipFill>
+                          <a:blip r:embed="rId11" cstate="none"/>
+                          <a:srcRect/>
+                          <a:stretch>
+                            <a:fillRect/>
+                          </a:stretch>
+                        </pic:blipFill>
+                        <pic:spPr bwMode="auto">
+                          <a:xfrm>
+                            <a:off x="0" y="0"/>
+                            <a:ext cx="1809750" cy="1133475"/>
+                          </a:xfrm>
+                          <a:prstGeom prst="rect">
+                            <a:avLst/>
+                          </a:prstGeom>
+                        </pic:spPr>
+                      </pic:pic>
+                    </a:graphicData>
+                  </a:graphic>
+                </wp:inline>
+              </w:drawing>
+            </w:r>
+          </w:p>
+          <w:p>
+            <w:pPr>
+              <w:spacing w:after="0"/>
+              <w:jc w:val="center"/>
+            </w:pPr>
+            <w:r>
+              <w:rPr>
+                <w:rFonts w:ascii="游ゴシック" w:cs="游ゴシック" w:eastAsia="游ゴシック" w:hAnsi="游ゴシック"/>
+                <w:b w:val="false"/>
+                <w:bCs w:val="false"/>
+                <w:i w:val="false"/>
+                <w:iCs w:val="false"/>
+                <w:sz w:val="16"/>
+                <w:szCs w:val="16"/>
+              </w:rPr>
+              <w:t xml:space="preserve">マリア</w:t>
+            </w:r>
+          </w:p>
+        </w:tc>
+        <w:tc>
+          <w:tcPr>
+            <w:tcW w:type="dxa" w:w="2150"/>
+            <w:tcBorders>
+              <w:top w:val="dashed" w:color="999999" w:sz="4"/>
+              <w:left w:val="dashed" w:color="999999" w:sz="4"/>
+              <w:bottom w:val="dashed" w:color="999999" w:sz="4"/>
+              <w:right w:val="dashed" w:color="999999" w:sz="4"/>
+            </w:tcBorders>
+            <w:shd w:fill="FFFFFF" w:color="auto" w:val="clear"/>
+            <w:tcMar>
+              <w:top w:type="dxa" w:w="80"/>
+              <w:left w:type="dxa" w:w="60"/>
+              <w:bottom w:type="dxa" w:w="80"/>
+              <w:right w:type="dxa" w:w="60"/>
+            </w:tcMar>
+          </w:tcPr>
+          <w:p>
+            <w:pPr>
+              <w:spacing w:after="40"/>
+              <w:jc w:val="center"/>
+            </w:pPr>
+            <w:r>
+              <w:drawing>
+                <wp:inline distT="0" distB="0" distL="0" distR="0">
+                  <wp:extent cx="1809750" cy="1133475"/>
+                  <wp:effectExtent t="0" r="0" b="0" l="0"/>
+                  <wp:docPr id="1" name="" descr="" title=""/>
+                  <wp:cNvGraphicFramePr>
+                    <a:graphicFrameLocks xmlns:a="http://schemas.openxmlformats.org/drawingml/2006/main" noChangeAspect="1"/>
+                  </wp:cNvGraphicFramePr>
+                  <a:graphic xmlns:a="http://schemas.openxmlformats.org/drawingml/2006/main">
+                    <a:graphicData uri="http://schemas.openxmlformats.org/drawingml/2006/picture">
+                      <pic:pic xmlns:pic="http://schemas.openxmlformats.org/drawingml/2006/picture">
+                        <pic:nvPicPr>
+                          <pic:cNvPr id="0" name="" descr=""/>
+                          <pic:cNvPicPr>
+                            <a:picLocks noChangeAspect="1" noChangeArrowheads="1"/>
+                          </pic:cNvPicPr>
+                        </pic:nvPicPr>
+                        <pic:blipFill>
+                          <a:blip r:embed="rId12" cstate="none"/>
+                          <a:srcRect/>
+                          <a:stretch>
+                            <a:fillRect/>
+                          </a:stretch>
+                        </pic:blipFill>
+                        <pic:spPr bwMode="auto">
+                          <a:xfrm>
+                            <a:off x="0" y="0"/>
+                            <a:ext cx="1809750" cy="1133475"/>
+                          </a:xfrm>
+                          <a:prstGeom prst="rect">
+                            <a:avLst/>
+                          </a:prstGeom>
+                        </pic:spPr>
+                      </pic:pic>
+                    </a:graphicData>
+                  </a:graphic>
+                </wp:inline>
+              </w:drawing>
+            </w:r>
+          </w:p>
+          <w:p>
+            <w:pPr>
+              <w:spacing w:after="0"/>
+              <w:jc w:val="center"/>
+            </w:pPr>
+            <w:r>
+              <w:rPr>
+                <w:rFonts w:ascii="游ゴシック" w:cs="游ゴシック" w:eastAsia="游ゴシック" w:hAnsi="游ゴシック"/>
+                <w:b w:val="false"/>
+                <w:bCs w:val="false"/>
+                <w:i w:val="false"/>
+                <w:iCs w:val="false"/>
+                <w:sz w:val="16"/>
+                <w:szCs w:val="16"/>
+              </w:rPr>
+              <w:t xml:space="preserve">ロコモコ</w:t>
+            </w:r>
+          </w:p>
+        </w:tc>
+        <w:tc>
+          <w:tcPr>
+            <w:tcW w:type="dxa" w:w="2250"/>
+          </w:tcPr>
+          <w:p>
+            <w:pPr>
+              <w:spacing w:after="0"/>
+              <w:jc w:val="left"/>
+            </w:pPr>
+            <w:r>
+              <w:rPr>
+                <w:rFonts w:ascii="游ゴシック" w:cs="游ゴシック" w:eastAsia="游ゴシック" w:hAnsi="游ゴシック"/>
+                <w:b w:val="false"/>
+                <w:bCs w:val="false"/>
+                <w:i w:val="false"/>
+                <w:iCs w:val="false"/>
+                <w:sz w:val="22"/>
+                <w:szCs w:val="22"/>
+              </w:rPr>
+              <w:t xml:space="preserve"/>
+            </w:r>
+          </w:p>
+        </w:tc>
+        <w:tc>
+          <w:tcPr>
+            <w:tcW w:type="dxa" w:w="2250"/>
+          </w:tcPr>
+          <w:p>
+            <w:pPr>
+              <w:spacing w:after="0"/>
+              <w:jc w:val="left"/>
+            </w:pPr>
+            <w:r>
+              <w:rPr>
+                <w:rFonts w:ascii="游ゴシック" w:cs="游ゴシック" w:eastAsia="游ゴシック" w:hAnsi="游ゴシック"/>
+                <w:b w:val="false"/>
+                <w:bCs w:val="false"/>
+                <w:i w:val="false"/>
+                <w:iCs w:val="false"/>
+                <w:sz w:val="22"/>
+                <w:szCs w:val="22"/>
+              </w:rPr>
+              <w:t xml:space="preserve"/>
+            </w:r>
+          </w:p>
+        </w:tc>
+      </w:tr>
+    </w:tbl>
     <w:sectPr>
       <w:pgSz w:w="12240" w:h="15840" w:orient="portrait"/>
       <w:pgMar w:top="700" w:right="900" w:bottom="700" w:left="900" w:header="708" w:footer="708" w:gutter="0"/>

</xml_diff>